<commit_message>
async-await keywords, fetch API and HTTP requests with React App (day-6 and 7 code)
</commit_message>
<xml_diff>
--- a/pics/promise api.docx
+++ b/pics/promise api.docx
@@ -10,7 +10,7 @@
         <mc:AlternateContent>
           <mc:Choice Requires="wps">
             <w:drawing>
-              <wp:anchor distT="0" distB="0" distL="114300" distR="114300" simplePos="0" relativeHeight="251685888" behindDoc="0" locked="0" layoutInCell="1" allowOverlap="1" wp14:anchorId="75A5DBB9" wp14:editId="684F644E">
+              <wp:anchor distT="0" distB="0" distL="114300" distR="114300" simplePos="0" relativeHeight="251685888" behindDoc="0" locked="0" layoutInCell="1" allowOverlap="1" wp14:anchorId="75A5DBB9" wp14:editId="1E1285D3">
                 <wp:simplePos x="0" y="0"/>
                 <wp:positionH relativeFrom="column">
                   <wp:posOffset>1769533</wp:posOffset>
@@ -18,8 +18,8 @@
                 <wp:positionV relativeFrom="paragraph">
                   <wp:posOffset>1680633</wp:posOffset>
                 </wp:positionV>
-                <wp:extent cx="575733" cy="330200"/>
-                <wp:effectExtent l="0" t="0" r="15240" b="12700"/>
+                <wp:extent cx="698500" cy="330200"/>
+                <wp:effectExtent l="0" t="0" r="25400" b="12700"/>
                 <wp:wrapNone/>
                 <wp:docPr id="1412924431" name="Text Box 12"/>
                 <wp:cNvGraphicFramePr/>
@@ -30,7 +30,7 @@
                       <wps:spPr>
                         <a:xfrm>
                           <a:off x="0" y="0"/>
-                          <a:ext cx="575733" cy="330200"/>
+                          <a:ext cx="698500" cy="330200"/>
                         </a:xfrm>
                         <a:prstGeom prst="rect">
                           <a:avLst/>
@@ -50,8 +50,19 @@
                       <wps:txbx>
                         <w:txbxContent>
                           <w:p>
+                            <w:proofErr w:type="gramStart"/>
                             <w:r>
-                              <w:t>catch</w:t>
+                              <w:t>C</w:t>
+                            </w:r>
+                            <w:r>
+                              <w:t>atch</w:t>
+                            </w:r>
+                            <w:r>
+                              <w:t>(</w:t>
+                            </w:r>
+                            <w:proofErr w:type="gramEnd"/>
+                            <w:r>
+                              <w:t>)</w:t>
                             </w:r>
                           </w:p>
                         </w:txbxContent>
@@ -77,12 +88,23 @@
                 <v:stroke joinstyle="miter"/>
                 <v:path gradientshapeok="t" o:connecttype="rect"/>
               </v:shapetype>
-              <v:shape id="Text Box 12" o:spid="_x0000_s1026" type="#_x0000_t202" style="position:absolute;margin-left:139.35pt;margin-top:132.35pt;width:45.35pt;height:26pt;z-index:251685888;visibility:visible;mso-wrap-style:square;mso-width-percent:0;mso-wrap-distance-left:9pt;mso-wrap-distance-top:0;mso-wrap-distance-right:9pt;mso-wrap-distance-bottom:0;mso-position-horizontal:absolute;mso-position-horizontal-relative:text;mso-position-vertical:absolute;mso-position-vertical-relative:text;mso-width-percent:0;mso-width-relative:margin;v-text-anchor:top" o:gfxdata="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" fillcolor="#47d459 [1942]" strokeweight=".5pt">
+              <v:shape id="Text Box 12" o:spid="_x0000_s1026" type="#_x0000_t202" style="position:absolute;margin-left:139.35pt;margin-top:132.35pt;width:55pt;height:26pt;z-index:251685888;visibility:visible;mso-wrap-style:square;mso-width-percent:0;mso-wrap-distance-left:9pt;mso-wrap-distance-top:0;mso-wrap-distance-right:9pt;mso-wrap-distance-bottom:0;mso-position-horizontal:absolute;mso-position-horizontal-relative:text;mso-position-vertical:absolute;mso-position-vertical-relative:text;mso-width-percent:0;mso-width-relative:margin;v-text-anchor:top" o:gfxdata="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" fillcolor="#47d459 [1942]" strokeweight=".5pt">
                 <v:textbox>
                   <w:txbxContent>
                     <w:p>
-                      <w:r>
-                        <w:t>catch</w:t>
+                      <w:proofErr w:type="gramStart"/>
+                      <w:r>
+                        <w:t>C</w:t>
+                      </w:r>
+                      <w:r>
+                        <w:t>atch</w:t>
+                      </w:r>
+                      <w:r>
+                        <w:t>(</w:t>
+                      </w:r>
+                      <w:proofErr w:type="gramEnd"/>
+                      <w:r>
+                        <w:t>)</w:t>
                       </w:r>
                     </w:p>
                   </w:txbxContent>
@@ -99,16 +121,16 @@
         <mc:AlternateContent>
           <mc:Choice Requires="wps">
             <w:drawing>
-              <wp:anchor distT="0" distB="0" distL="114300" distR="114300" simplePos="0" relativeHeight="251683840" behindDoc="0" locked="0" layoutInCell="1" allowOverlap="1" wp14:anchorId="67C8C078" wp14:editId="1F55E81C">
+              <wp:anchor distT="0" distB="0" distL="114300" distR="114300" simplePos="0" relativeHeight="251683840" behindDoc="0" locked="0" layoutInCell="1" allowOverlap="1" wp14:anchorId="67C8C078" wp14:editId="40F90A57">
                 <wp:simplePos x="0" y="0"/>
                 <wp:positionH relativeFrom="column">
-                  <wp:posOffset>216112</wp:posOffset>
+                  <wp:posOffset>76200</wp:posOffset>
                 </wp:positionH>
                 <wp:positionV relativeFrom="paragraph">
                   <wp:posOffset>1358900</wp:posOffset>
                 </wp:positionV>
-                <wp:extent cx="550334" cy="330200"/>
-                <wp:effectExtent l="0" t="0" r="21590" b="12700"/>
+                <wp:extent cx="689610" cy="330200"/>
+                <wp:effectExtent l="0" t="0" r="15240" b="12700"/>
                 <wp:wrapNone/>
                 <wp:docPr id="56506858" name="Text Box 12"/>
                 <wp:cNvGraphicFramePr/>
@@ -119,7 +141,7 @@
                       <wps:spPr>
                         <a:xfrm>
                           <a:off x="0" y="0"/>
-                          <a:ext cx="550334" cy="330200"/>
+                          <a:ext cx="689610" cy="330200"/>
                         </a:xfrm>
                         <a:prstGeom prst="rect">
                           <a:avLst/>
@@ -139,8 +161,19 @@
                       <wps:txbx>
                         <w:txbxContent>
                           <w:p>
+                            <w:proofErr w:type="gramStart"/>
                             <w:r>
-                              <w:t>then</w:t>
+                              <w:t>T</w:t>
+                            </w:r>
+                            <w:r>
+                              <w:t>hen</w:t>
+                            </w:r>
+                            <w:r>
+                              <w:t>(</w:t>
+                            </w:r>
+                            <w:proofErr w:type="gramEnd"/>
+                            <w:r>
+                              <w:t>)</w:t>
                             </w:r>
                           </w:p>
                         </w:txbxContent>
@@ -162,12 +195,127 @@
           </mc:Choice>
           <mc:Fallback>
             <w:pict>
-              <v:shape w14:anchorId="67C8C078" id="_x0000_s1027" type="#_x0000_t202" style="position:absolute;margin-left:17pt;margin-top:107pt;width:43.35pt;height:26pt;z-index:251683840;visibility:visible;mso-wrap-style:square;mso-width-percent:0;mso-wrap-distance-left:9pt;mso-wrap-distance-top:0;mso-wrap-distance-right:9pt;mso-wrap-distance-bottom:0;mso-position-horizontal:absolute;mso-position-horizontal-relative:text;mso-position-vertical:absolute;mso-position-vertical-relative:text;mso-width-percent:0;mso-width-relative:margin;v-text-anchor:top" o:gfxdata="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" fillcolor="#47d459 [1942]" strokeweight=".5pt">
+              <v:shape w14:anchorId="67C8C078" id="_x0000_s1027" type="#_x0000_t202" style="position:absolute;margin-left:6pt;margin-top:107pt;width:54.3pt;height:26pt;z-index:251683840;visibility:visible;mso-wrap-style:square;mso-width-percent:0;mso-wrap-distance-left:9pt;mso-wrap-distance-top:0;mso-wrap-distance-right:9pt;mso-wrap-distance-bottom:0;mso-position-horizontal:absolute;mso-position-horizontal-relative:text;mso-position-vertical:absolute;mso-position-vertical-relative:text;mso-width-percent:0;mso-width-relative:margin;v-text-anchor:top" o:gfxdata="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" fillcolor="#47d459 [1942]" strokeweight=".5pt">
                 <v:textbox>
                   <w:txbxContent>
                     <w:p>
-                      <w:r>
-                        <w:t>then</w:t>
+                      <w:proofErr w:type="gramStart"/>
+                      <w:r>
+                        <w:t>T</w:t>
+                      </w:r>
+                      <w:r>
+                        <w:t>hen</w:t>
+                      </w:r>
+                      <w:r>
+                        <w:t>(</w:t>
+                      </w:r>
+                      <w:proofErr w:type="gramEnd"/>
+                      <w:r>
+                        <w:t>)</w:t>
+                      </w:r>
+                    </w:p>
+                  </w:txbxContent>
+                </v:textbox>
+              </v:shape>
+            </w:pict>
+          </mc:Fallback>
+        </mc:AlternateContent>
+      </w:r>
+      <w:r>
+        <w:rPr>
+          <w:noProof/>
+        </w:rPr>
+        <mc:AlternateContent>
+          <mc:Choice Requires="wps">
+            <w:drawing>
+              <wp:anchor distT="0" distB="0" distL="114300" distR="114300" simplePos="0" relativeHeight="251681792" behindDoc="0" locked="0" layoutInCell="1" allowOverlap="1" wp14:anchorId="10930C12" wp14:editId="0D3E4311">
+                <wp:simplePos x="0" y="0"/>
+                <wp:positionH relativeFrom="column">
+                  <wp:posOffset>2742777</wp:posOffset>
+                </wp:positionH>
+                <wp:positionV relativeFrom="paragraph">
+                  <wp:posOffset>761365</wp:posOffset>
+                </wp:positionV>
+                <wp:extent cx="901700" cy="330200"/>
+                <wp:effectExtent l="0" t="0" r="12700" b="12700"/>
+                <wp:wrapNone/>
+                <wp:docPr id="934223015" name="Text Box 12"/>
+                <wp:cNvGraphicFramePr/>
+                <a:graphic xmlns:a="http://schemas.openxmlformats.org/drawingml/2006/main">
+                  <a:graphicData uri="http://schemas.microsoft.com/office/word/2010/wordprocessingShape">
+                    <wps:wsp>
+                      <wps:cNvSpPr txBox="1"/>
+                      <wps:spPr>
+                        <a:xfrm>
+                          <a:off x="0" y="0"/>
+                          <a:ext cx="901700" cy="330200"/>
+                        </a:xfrm>
+                        <a:prstGeom prst="rect">
+                          <a:avLst/>
+                        </a:prstGeom>
+                        <a:solidFill>
+                          <a:schemeClr val="accent3">
+                            <a:lumMod val="60000"/>
+                            <a:lumOff val="40000"/>
+                          </a:schemeClr>
+                        </a:solidFill>
+                        <a:ln w="6350">
+                          <a:solidFill>
+                            <a:prstClr val="black"/>
+                          </a:solidFill>
+                        </a:ln>
+                      </wps:spPr>
+                      <wps:txbx>
+                        <w:txbxContent>
+                          <w:p>
+                            <w:proofErr w:type="gramStart"/>
+                            <w:r>
+                              <w:t>R</w:t>
+                            </w:r>
+                            <w:r>
+                              <w:t>eject</w:t>
+                            </w:r>
+                            <w:r>
+                              <w:t>(</w:t>
+                            </w:r>
+                            <w:proofErr w:type="gramEnd"/>
+                            <w:r>
+                              <w:t>)</w:t>
+                            </w:r>
+                          </w:p>
+                        </w:txbxContent>
+                      </wps:txbx>
+                      <wps:bodyPr rot="0" spcFirstLastPara="0" vertOverflow="overflow" horzOverflow="overflow" vert="horz" wrap="square" lIns="91440" tIns="45720" rIns="91440" bIns="45720" numCol="1" spcCol="0" rtlCol="0" fromWordArt="0" anchor="t" anchorCtr="0" forceAA="0" compatLnSpc="1">
+                        <a:prstTxWarp prst="textNoShape">
+                          <a:avLst/>
+                        </a:prstTxWarp>
+                        <a:noAutofit/>
+                      </wps:bodyPr>
+                    </wps:wsp>
+                  </a:graphicData>
+                </a:graphic>
+              </wp:anchor>
+            </w:drawing>
+          </mc:Choice>
+          <mc:Fallback>
+            <w:pict>
+              <v:shape w14:anchorId="10930C12" id="_x0000_s1028" type="#_x0000_t202" style="position:absolute;margin-left:215.95pt;margin-top:59.95pt;width:71pt;height:26pt;z-index:251681792;visibility:visible;mso-wrap-style:square;mso-wrap-distance-left:9pt;mso-wrap-distance-top:0;mso-wrap-distance-right:9pt;mso-wrap-distance-bottom:0;mso-position-horizontal:absolute;mso-position-horizontal-relative:text;mso-position-vertical:absolute;mso-position-vertical-relative:text;v-text-anchor:top" o:gfxdata="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" fillcolor="#47d459 [1942]" strokeweight=".5pt">
+                <v:textbox>
+                  <w:txbxContent>
+                    <w:p>
+                      <w:proofErr w:type="gramStart"/>
+                      <w:r>
+                        <w:t>R</w:t>
+                      </w:r>
+                      <w:r>
+                        <w:t>eject</w:t>
+                      </w:r>
+                      <w:r>
+                        <w:t>(</w:t>
+                      </w:r>
+                      <w:proofErr w:type="gramEnd"/>
+                      <w:r>
+                        <w:t>)</w:t>
                       </w:r>
                     </w:p>
                   </w:txbxContent>
@@ -376,10 +524,7 @@
                         <w:txbxContent>
                           <w:p>
                             <w:r>
-                              <w:t xml:space="preserve">      </w:t>
-                            </w:r>
-                            <w:r>
-                              <w:t>On success</w:t>
+                              <w:t xml:space="preserve">      On success</w:t>
                             </w:r>
                           </w:p>
                         </w:txbxContent>
@@ -629,10 +774,7 @@
                         <w:txbxContent>
                           <w:p>
                             <w:r>
-                              <w:t xml:space="preserve">      On </w:t>
-                            </w:r>
-                            <w:r>
-                              <w:t>failure</w:t>
+                              <w:t xml:space="preserve">      On failure</w:t>
                             </w:r>
                           </w:p>
                         </w:txbxContent>
@@ -679,7 +821,7 @@
         <mc:AlternateContent>
           <mc:Choice Requires="wps">
             <w:drawing>
-              <wp:anchor distT="0" distB="0" distL="114300" distR="114300" simplePos="0" relativeHeight="251669504" behindDoc="0" locked="0" layoutInCell="1" allowOverlap="1" wp14:anchorId="4006C646" wp14:editId="504990CB">
+              <wp:anchor distT="0" distB="0" distL="114300" distR="114300" simplePos="0" relativeHeight="251669504" behindDoc="0" locked="0" layoutInCell="1" allowOverlap="1" wp14:anchorId="4006C646" wp14:editId="6F070675">
                 <wp:simplePos x="0" y="0"/>
                 <wp:positionH relativeFrom="column">
                   <wp:posOffset>1054100</wp:posOffset>
@@ -737,90 +879,12 @@
           </mc:Choice>
           <mc:Fallback>
             <w:pict>
-              <v:shape w14:anchorId="0AE80BD5" id="Straight Arrow Connector 7" o:spid="_x0000_s1026" type="#_x0000_t32" style="position:absolute;margin-left:83pt;margin-top:92.65pt;width:116pt;height:75pt;flip:x y;z-index:251669504;visibility:visible;mso-wrap-style:square;mso-width-percent:0;mso-height-percent:0;mso-wrap-distance-left:9pt;mso-wrap-distance-top:0;mso-wrap-distance-right:9pt;mso-wrap-distance-bottom:0;mso-position-horizontal:absolute;mso-position-horizontal-relative:text;mso-position-vertical:absolute;mso-position-vertical-relative:text;mso-width-percent:0;mso-height-percent:0;mso-width-relative:margin;mso-height-relative:margin" o:gfxdata="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" strokecolor="#156082 [3204]" strokeweight="1.5pt">
+              <v:shapetype w14:anchorId="1C5E10D0" id="_x0000_t32" coordsize="21600,21600" o:spt="32" o:oned="t" path="m,l21600,21600e" filled="f">
+                <v:path arrowok="t" fillok="f" o:connecttype="none"/>
+                <o:lock v:ext="edit" shapetype="t"/>
+              </v:shapetype>
+              <v:shape id="Straight Arrow Connector 7" o:spid="_x0000_s1026" type="#_x0000_t32" style="position:absolute;margin-left:83pt;margin-top:92.65pt;width:116pt;height:75pt;flip:x y;z-index:251669504;visibility:visible;mso-wrap-style:square;mso-width-percent:0;mso-height-percent:0;mso-wrap-distance-left:9pt;mso-wrap-distance-top:0;mso-wrap-distance-right:9pt;mso-wrap-distance-bottom:0;mso-position-horizontal:absolute;mso-position-horizontal-relative:text;mso-position-vertical:absolute;mso-position-vertical-relative:text;mso-width-percent:0;mso-height-percent:0;mso-width-relative:margin;mso-height-relative:margin" o:gfxdata="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" strokecolor="#156082 [3204]" strokeweight="1.5pt">
                 <v:stroke endarrow="block" joinstyle="miter"/>
-              </v:shape>
-            </w:pict>
-          </mc:Fallback>
-        </mc:AlternateContent>
-      </w:r>
-      <w:r>
-        <w:rPr>
-          <w:noProof/>
-        </w:rPr>
-        <mc:AlternateContent>
-          <mc:Choice Requires="wps">
-            <w:drawing>
-              <wp:anchor distT="0" distB="0" distL="114300" distR="114300" simplePos="0" relativeHeight="251681792" behindDoc="0" locked="0" layoutInCell="1" allowOverlap="1" wp14:anchorId="10930C12" wp14:editId="55D53EF0">
-                <wp:simplePos x="0" y="0"/>
-                <wp:positionH relativeFrom="column">
-                  <wp:posOffset>2594610</wp:posOffset>
-                </wp:positionH>
-                <wp:positionV relativeFrom="paragraph">
-                  <wp:posOffset>812589</wp:posOffset>
-                </wp:positionV>
-                <wp:extent cx="901700" cy="330200"/>
-                <wp:effectExtent l="0" t="0" r="12700" b="12700"/>
-                <wp:wrapNone/>
-                <wp:docPr id="934223015" name="Text Box 12"/>
-                <wp:cNvGraphicFramePr/>
-                <a:graphic xmlns:a="http://schemas.openxmlformats.org/drawingml/2006/main">
-                  <a:graphicData uri="http://schemas.microsoft.com/office/word/2010/wordprocessingShape">
-                    <wps:wsp>
-                      <wps:cNvSpPr txBox="1"/>
-                      <wps:spPr>
-                        <a:xfrm>
-                          <a:off x="0" y="0"/>
-                          <a:ext cx="901700" cy="330200"/>
-                        </a:xfrm>
-                        <a:prstGeom prst="rect">
-                          <a:avLst/>
-                        </a:prstGeom>
-                        <a:solidFill>
-                          <a:schemeClr val="accent3">
-                            <a:lumMod val="60000"/>
-                            <a:lumOff val="40000"/>
-                          </a:schemeClr>
-                        </a:solidFill>
-                        <a:ln w="6350">
-                          <a:solidFill>
-                            <a:prstClr val="black"/>
-                          </a:solidFill>
-                        </a:ln>
-                      </wps:spPr>
-                      <wps:txbx>
-                        <w:txbxContent>
-                          <w:p>
-                            <w:r>
-                              <w:t>reject</w:t>
-                            </w:r>
-                          </w:p>
-                        </w:txbxContent>
-                      </wps:txbx>
-                      <wps:bodyPr rot="0" spcFirstLastPara="0" vertOverflow="overflow" horzOverflow="overflow" vert="horz" wrap="square" lIns="91440" tIns="45720" rIns="91440" bIns="45720" numCol="1" spcCol="0" rtlCol="0" fromWordArt="0" anchor="t" anchorCtr="0" forceAA="0" compatLnSpc="1">
-                        <a:prstTxWarp prst="textNoShape">
-                          <a:avLst/>
-                        </a:prstTxWarp>
-                        <a:noAutofit/>
-                      </wps:bodyPr>
-                    </wps:wsp>
-                  </a:graphicData>
-                </a:graphic>
-              </wp:anchor>
-            </w:drawing>
-          </mc:Choice>
-          <mc:Fallback>
-            <w:pict>
-              <v:shape w14:anchorId="10930C12" id="_x0000_s1031" type="#_x0000_t202" style="position:absolute;margin-left:204.3pt;margin-top:64pt;width:71pt;height:26pt;z-index:251681792;visibility:visible;mso-wrap-style:square;mso-wrap-distance-left:9pt;mso-wrap-distance-top:0;mso-wrap-distance-right:9pt;mso-wrap-distance-bottom:0;mso-position-horizontal:absolute;mso-position-horizontal-relative:text;mso-position-vertical:absolute;mso-position-vertical-relative:text;v-text-anchor:top" o:gfxdata="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" fillcolor="#47d459 [1942]" strokeweight=".5pt">
-                <v:textbox>
-                  <w:txbxContent>
-                    <w:p>
-                      <w:r>
-                        <w:t>reject</w:t>
-                      </w:r>
-                    </w:p>
-                  </w:txbxContent>
-                </v:textbox>
               </v:shape>
             </w:pict>
           </mc:Fallback>
@@ -873,8 +937,19 @@
                       <wps:txbx>
                         <w:txbxContent>
                           <w:p>
+                            <w:proofErr w:type="gramStart"/>
                             <w:r>
-                              <w:t>resolve</w:t>
+                              <w:t>R</w:t>
+                            </w:r>
+                            <w:r>
+                              <w:t>esolve</w:t>
+                            </w:r>
+                            <w:r>
+                              <w:t>(</w:t>
+                            </w:r>
+                            <w:proofErr w:type="gramEnd"/>
+                            <w:r>
+                              <w:t>)</w:t>
                             </w:r>
                           </w:p>
                         </w:txbxContent>
@@ -897,8 +972,19 @@
                 <v:textbox>
                   <w:txbxContent>
                     <w:p>
-                      <w:r>
-                        <w:t>resolve</w:t>
+                      <w:proofErr w:type="gramStart"/>
+                      <w:r>
+                        <w:t>R</w:t>
+                      </w:r>
+                      <w:r>
+                        <w:t>esolve</w:t>
+                      </w:r>
+                      <w:r>
+                        <w:t>(</w:t>
+                      </w:r>
+                      <w:proofErr w:type="gramEnd"/>
+                      <w:r>
+                        <w:t>)</w:t>
                       </w:r>
                     </w:p>
                   </w:txbxContent>
@@ -1120,10 +1206,7 @@
                               <w:jc w:val="center"/>
                             </w:pPr>
                             <w:r>
-                              <w:t xml:space="preserve">state </w:t>
-                            </w:r>
-                            <w:r>
-                              <w:t>= rejected</w:t>
+                              <w:t>state = rejected</w:t>
                             </w:r>
                           </w:p>
                           <w:p>
@@ -1131,10 +1214,7 @@
                               <w:jc w:val="center"/>
                             </w:pPr>
                             <w:r>
-                              <w:t xml:space="preserve">result = </w:t>
-                            </w:r>
-                            <w:r>
-                              <w:t>reason</w:t>
+                              <w:t>result = reason</w:t>
                             </w:r>
                           </w:p>
                         </w:txbxContent>
@@ -1313,10 +1393,7 @@
                               <w:jc w:val="center"/>
                             </w:pPr>
                             <w:r>
-                              <w:t xml:space="preserve">state = </w:t>
-                            </w:r>
-                            <w:r>
-                              <w:t>resolved/ fulfilled</w:t>
+                              <w:t>state = resolved/ fulfilled</w:t>
                             </w:r>
                           </w:p>
                           <w:p>
@@ -1324,10 +1401,7 @@
                               <w:jc w:val="center"/>
                             </w:pPr>
                             <w:r>
-                              <w:t xml:space="preserve">result = </w:t>
-                            </w:r>
-                            <w:r>
-                              <w:t>4</w:t>
+                              <w:t>result = 4</w:t>
                             </w:r>
                           </w:p>
                         </w:txbxContent>

</xml_diff>